<commit_message>
Deploy preview for PR 15 🛫
</commit_message>
<xml_diff>
--- a/pr-preview/pr-15/vignettes/getting-started.docx
+++ b/pr-preview/pr-15/vignettes/getting-started.docx
@@ -27,7 +27,7 @@
         <w:t xml:space="preserve">(rpt)</w:t>
       </w:r>
     </w:p>
-    <w:bookmarkStart w:id="20" w:name="introduction"/>
+    <w:bookmarkStart w:id="9" w:name="introduction"/>
     <w:p>
       <w:pPr>
         <w:pStyle w:val="Heading2"/>
@@ -59,8 +59,8 @@
         <w:t xml:space="preserve">package.</w:t>
       </w:r>
     </w:p>
-    <w:bookmarkEnd w:id="20"/>
-    <w:bookmarkStart w:id="21" w:name="basic-usage"/>
+    <w:bookmarkEnd w:id="9"/>
+    <w:bookmarkStart w:id="10" w:name="basic-usage"/>
     <w:p>
       <w:pPr>
         <w:pStyle w:val="Heading2"/>
@@ -184,8 +184,8 @@
         <w:t xml:space="preserve">#&gt; [1] 3</w:t>
       </w:r>
     </w:p>
-    <w:bookmarkEnd w:id="21"/>
-    <w:bookmarkStart w:id="22" w:name="next-steps"/>
+    <w:bookmarkEnd w:id="10"/>
+    <w:bookmarkStart w:id="11" w:name="next-steps"/>
     <w:p>
       <w:pPr>
         <w:pStyle w:val="Heading2"/>
@@ -202,7 +202,7 @@
         <w:t xml:space="preserve">For more information, see the package documentation.</w:t>
       </w:r>
     </w:p>
-    <w:bookmarkEnd w:id="22"/>
+    <w:bookmarkEnd w:id="11"/>
     <w:sectPr>
       <w:footnotePr>
         <w:numRestart w:val="eachSect"/>
@@ -324,10 +324,10 @@
   <w:docDefaults>
     <w:rPrDefault>
       <w:rPr>
-        <w:rFonts w:asciiTheme="minorHAnsi" w:cstheme="minorBidi" w:eastAsiaTheme="minorHAnsi" w:hAnsiTheme="minorHAnsi"/>
+        <w:rFonts w:asciiTheme="minorHAnsi" w:cstheme="minorBidi" w:eastAsiaTheme="minorEastAsia" w:hAnsiTheme="minorHAnsi"/>
         <w:sz w:val="24"/>
         <w:szCs w:val="24"/>
-        <w:lang w:bidi="ar-SA" w:eastAsia="en-US" w:val="en-US"/>
+        <w:lang w:bidi="ar-SA" w:eastAsia="zh-CN" w:val="en-US"/>
       </w:rPr>
     </w:rPrDefault>
     <w:pPrDefault>
@@ -868,13 +868,6 @@
       </w:tblCellMar>
     </w:tblPr>
     <w:tblStylePr w:type="firstRow">
-      <w:tblPr>
-        <w:jc w:val="left"/>
-        <w:tblInd w:type="dxa" w:w="0"/>
-      </w:tblPr>
-      <w:trPr>
-        <w:jc w:val="left"/>
-      </w:trPr>
       <w:tcPr>
         <w:tcBorders>
           <w:bottom w:val="single"/>

</xml_diff>